<commit_message>
feat: meditation audio restoration and business plan update
</commit_message>
<xml_diff>
--- a/UIsauce/오지상승위_AI_기획_요약.docx
+++ b/UIsauce/오지상승위_AI_기획_요약.docx
@@ -9152,15 +9152,7 @@
     <w:p>
       <w:pPr>
         <w:rPr>
-          <w:rFonts w:eastAsia="맑은 고딕"/>
-          <w:lang w:eastAsia="ko-KR"/>
-        </w:rPr>
-      </w:pPr>
-    </w:p>
-    <w:p>
-      <w:pPr>
-        <w:rPr>
-          <w:rFonts w:ascii="Noto Sans KR" w:eastAsia="Noto Sans KR" w:hAnsi="Noto Sans KR"/>
+          <w:rFonts w:ascii="Noto Sans KR" w:eastAsia="Noto Sans KR" w:hAnsi="Noto Sans KR" w:cs="바탕체"/>
           <w:b/>
           <w:sz w:val="32"/>
           <w:lang w:eastAsia="ko-KR"/>
@@ -9171,79 +9163,10 @@
           <w:rFonts w:ascii="Noto Sans KR" w:eastAsia="Noto Sans KR" w:hAnsi="Noto Sans KR" w:cs="바탕체" w:hint="eastAsia"/>
           <w:b/>
           <w:sz w:val="32"/>
-          <w:lang w:eastAsia="ko-KR"/>
-        </w:rPr>
-        <w:t>명상 스크립트 및 음악이 나오는 화면 예시</w:t>
-      </w:r>
-    </w:p>
-    <w:p>
-      <w:r>
-        <w:rPr>
-          <w:noProof/>
-          <w:lang w:eastAsia="ko-KR"/>
-        </w:rPr>
-        <w:drawing>
-          <wp:inline distT="0" distB="0" distL="0" distR="0" wp14:anchorId="2922CEE4" wp14:editId="1FC48EDF">
-            <wp:extent cx="3228975" cy="3918460"/>
-            <wp:effectExtent l="0" t="0" r="0" b="6350"/>
-            <wp:docPr id="1" name="그림 1"/>
-            <wp:cNvGraphicFramePr>
-              <a:graphicFrameLocks xmlns:a="http://schemas.openxmlformats.org/drawingml/2006/main" noChangeAspect="1"/>
-            </wp:cNvGraphicFramePr>
-            <a:graphic xmlns:a="http://schemas.openxmlformats.org/drawingml/2006/main">
-              <a:graphicData uri="http://schemas.openxmlformats.org/drawingml/2006/picture">
-                <pic:pic xmlns:pic="http://schemas.openxmlformats.org/drawingml/2006/picture">
-                  <pic:nvPicPr>
-                    <pic:cNvPr id="1" name=""/>
-                    <pic:cNvPicPr/>
-                  </pic:nvPicPr>
-                  <pic:blipFill>
-                    <a:blip r:embed="rId8"/>
-                    <a:stretch>
-                      <a:fillRect/>
-                    </a:stretch>
-                  </pic:blipFill>
-                  <pic:spPr>
-                    <a:xfrm>
-                      <a:off x="0" y="0"/>
-                      <a:ext cx="3237816" cy="3929188"/>
-                    </a:xfrm>
-                    <a:prstGeom prst="rect">
-                      <a:avLst/>
-                    </a:prstGeom>
-                  </pic:spPr>
-                </pic:pic>
-              </a:graphicData>
-            </a:graphic>
-          </wp:inline>
-        </w:drawing>
-      </w:r>
-    </w:p>
-    <w:p/>
-    <w:p/>
-    <w:p/>
-    <w:p/>
-    <w:p/>
-    <w:p/>
-    <w:p/>
-    <w:p/>
-    <w:p>
-      <w:pPr>
-        <w:rPr>
-          <w:rFonts w:ascii="Noto Sans KR" w:eastAsia="Noto Sans KR" w:hAnsi="Noto Sans KR" w:cs="바탕체"/>
-          <w:b/>
-          <w:sz w:val="32"/>
-          <w:lang w:eastAsia="ko-KR"/>
-        </w:rPr>
-      </w:pPr>
-      <w:r>
-        <w:rPr>
-          <w:rFonts w:ascii="Noto Sans KR" w:eastAsia="Noto Sans KR" w:hAnsi="Noto Sans KR" w:cs="바탕체" w:hint="eastAsia"/>
-          <w:b/>
-          <w:sz w:val="32"/>
           <w:highlight w:val="yellow"/>
           <w:lang w:eastAsia="ko-KR"/>
         </w:rPr>
+        <w:lastRenderedPageBreak/>
         <w:t>[</w:t>
       </w:r>
       <w:r>
@@ -10106,6 +10029,7 @@
                 <w:highlight w:val="yellow"/>
                 <w:lang w:eastAsia="ko-KR"/>
               </w:rPr>
+              <w:lastRenderedPageBreak/>
               <w:t>B2C</w:t>
             </w:r>
           </w:p>
@@ -10593,6 +10517,7 @@
         <w:rPr>
           <w:sz w:val="40"/>
         </w:rPr>
+        <w:lastRenderedPageBreak/>
         <w:t>Daily</w:t>
       </w:r>
     </w:p>
@@ -18523,8 +18448,6 @@
         </w:rPr>
         <w:t xml:space="preserve"> 입력</w:t>
       </w:r>
-      <w:bookmarkStart w:id="0" w:name="_GoBack"/>
-      <w:bookmarkEnd w:id="0"/>
     </w:p>
     <w:p>
       <w:pPr>
@@ -19878,6 +19801,8 @@
         </w:rPr>
         <w:t>구조</w:t>
       </w:r>
+      <w:bookmarkStart w:id="0" w:name="_GoBack"/>
+      <w:bookmarkEnd w:id="0"/>
     </w:p>
     <w:p>
       <w:pPr>
@@ -20331,7 +20256,7 @@
           <w:sz w:val="24"/>
         </w:rPr>
         <w:pict>
-          <v:rect id="_x0000_i1031" style="width:0;height:1.5pt" o:hralign="center" o:hrstd="t" o:hr="t" fillcolor="#a0a0a0" stroked="f"/>
+          <v:rect id="_x0000_i1042" style="width:0;height:1.5pt" o:hralign="center" o:hrstd="t" o:hr="t" fillcolor="#a0a0a0" stroked="f"/>
         </w:pict>
       </w:r>
     </w:p>
@@ -45384,7 +45309,7 @@
 </file>
 
 <file path=customXml/itemProps1.xml><?xml version="1.0" encoding="utf-8"?>
-<ds:datastoreItem xmlns:ds="http://schemas.openxmlformats.org/officeDocument/2006/customXml" ds:itemID="{FC687A02-2C97-447F-8CBD-A1E9A0806EA7}">
+<ds:datastoreItem xmlns:ds="http://schemas.openxmlformats.org/officeDocument/2006/customXml" ds:itemID="{468255B6-3838-40B8-A261-5D4E698B9FC4}">
   <ds:schemaRefs>
     <ds:schemaRef ds:uri="http://schemas.openxmlformats.org/officeDocument/2006/bibliography"/>
   </ds:schemaRefs>

</xml_diff>